<commit_message>
Update to final Fall 2026 allocations; publish neutral adjustment notes; rewrite README
Co-Authored-By: Claude Opus 5.5 <noreply@anthropic.com>
</commit_message>
<xml_diff>
--- a/policy/Fall 2026 Funding - One-Page Guide for HSOs.docx
+++ b/policy/Fall 2026 Funding - One-Page Guide for HSOs.docx
@@ -241,7 +241,7 @@
                 <w:szCs w:val="18"/>
                 <w:rtl w:val="0"/>
               </w:rPr>
-              <w:t>Requests total ~3.5x the budget</w:t>
+              <w:t>Requests total ~3.6x the budget</w:t>
             </w:r>
             <w:r>
               <w:rPr>
@@ -273,7 +273,7 @@
           <w:szCs w:val="20"/>
           <w:rtl w:val="0"/>
         </w:rPr>
-        <w:t>a club asks $2,000; food rules trim $500; eligible $1,500; at a mid-range score its share plus the base lands near $1,000, about half the ask. The pool covers about a third of total demand, so large asks typically land at 30-50%. But a club that asks only for what it needs can be funded in full: allocations never exceed your eligible request, and modest, well-itemized asks routinely hit that ceiling. Ask for your real gap and 100% is achievable; ask for everything imaginable and the average is what you get.</w:t>
+        <w:t>a club asks $2,000; food rules trim $500; eligible $1,500; at a mid-range score its share plus the base lands near $600, about 30% of the ask. The budget covers a little over a quarter of total demand, so large asks typically land at 20-40%. But a club that asks only for what it needs can be funded in full: allocations never exceed your eligible request, and modest, well-itemized asks routinely hit that ceiling. Ask for your real gap and 100% is achievable; ask for everything imaginable and the average is what you get.</w:t>
       </w:r>
       <w:r>
         <w:rPr>

</xml_diff>